<commit_message>
PDFs of the proposal and the pitch: tools/proposal.py --pdf
- emit_pdf sets both documents with reportlab in FreeSans (LibreOffice
  cannot load a document in this environment); tables wrap with repeated
  headers, figures keep their captions, pages carry a running title and
  number. 39 pages and 2 pages.
- --export-only emits .docx / .pdf from the files on disk without
  re-running the instruments.
- Bullet continuation lines now stay inside their bullet in both the Word
  and the PDF emitters.
- docs/PROPOSAL.md and proposals/README.md record the PDF route.

Co-Authored-By: Claude Fable 5.1 <noreply@anthropic.com>
Claude-Session: https://claude.ai/code/session_01L65Vc1Khq4pbett1bFacxK
</commit_message>
<xml_diff>
--- a/proposals/Pitch_v0.2.docx
+++ b/proposals/Pitch_v0.2.docx
@@ -31,12 +31,7 @@
         <w:pStyle w:val="ListBullet"/>
       </w:pPr>
       <w:r>
-        <w:t>One state-owned program under one Authority, two severable projects, funded once by general-obligation bonds and</w:t>
-      </w:r>
-    </w:p>
-    <w:p>
-      <w:r>
-        <w:t>never again by the treasury.</w:t>
+        <w:t>One state-owned program under one Authority, two severable projects, funded once by general-obligation bonds and never again by the treasury.</w:t>
       </w:r>
     </w:p>
     <w:p>
@@ -74,12 +69,7 @@
         <w:t>Decision requested:</w:t>
       </w:r>
       <w:r>
-        <w:t xml:space="preserve"> fund the studies and surveys now, $213–463 million, and know within</w:t>
-      </w:r>
-    </w:p>
-    <w:p>
-      <w:r>
-        <w:t>2–4 years whether the rest is worth $67–114 billion.</w:t>
+        <w:t xml:space="preserve"> fund the studies and surveys now, $213–463 million, and know within 2–4 years whether the rest is worth $67–114 billion.</w:t>
       </w:r>
     </w:p>
     <w:p>
@@ -101,12 +91,7 @@
         <w:t>Helios-3.</w:t>
       </w:r>
       <w:r>
-        <w:t xml:space="preserve"> Concentrating solar on three desert nodes — Mojave, Imperial, the Westside — with falling-particle</w:t>
-      </w:r>
-    </w:p>
-    <w:p>
-      <w:r>
-        <w:t>receivers and supercritical-CO₂ turbines instead of salt and steam, so the same sun makes half again as much power (sun to socket 0.168 as proposed, 0.252 at mid).</w:t>
+        <w:t xml:space="preserve"> Concentrating solar on three desert nodes — Mojave, Imperial, the Westside — with falling-particle receivers and supercritical-CO₂ turbines instead of salt and steam, so the same sun makes half again as much power (sun to socket 0.168 as proposed, 0.252 at mid).</w:t>
       </w:r>
     </w:p>
     <w:p>
@@ -114,12 +99,7 @@
         <w:pStyle w:val="ListBullet"/>
       </w:pPr>
       <w:r>
-        <w:t>Daytime load goes straight from photovoltaics without touching a mirror; the mirror field is sized for the night;</w:t>
-      </w:r>
-    </w:p>
-    <w:p>
-      <w:r>
-        <w:t>the particle store carries the evening peak.</w:t>
+        <w:t>Daytime load goes straight from photovoltaics without touching a mirror; the mirror field is sized for the night; the particle store carries the evening peak.</w:t>
       </w:r>
     </w:p>
     <w:p>
@@ -127,12 +107,7 @@
         <w:pStyle w:val="ListBullet"/>
       </w:pPr>
       <w:r>
-        <w:t>As sized at mid: 18.1 million m² of mirror on 14 towers, a 2,620 MWe block, 2,894 MW of PV. At critical: 30.9 million m²,</w:t>
-      </w:r>
-    </w:p>
-    <w:p>
-      <w:r>
-        <w:t>24 towers, 2,620 MWe, 3,101 MW. The adopted route then grows the field by a quarter and the block by half to close the evening.</w:t>
+        <w:t>As sized at mid: 18.1 million m² of mirror on 14 towers, a 2,620 MWe block, 2,894 MW of PV. At critical: 30.9 million m², 24 towers, 2,620 MWe, 3,101 MW. The adopted route then grows the field by a quarter and the block by half to close the evening.</w:t>
       </w:r>
     </w:p>
     <w:p>
@@ -146,12 +121,7 @@
         <w:t>Aqua-Sovereign.</w:t>
       </w:r>
       <w:r>
-        <w:t xml:space="preserve"> Seawater reverse osmosis on retired coastal power plants, brine back through the permitted</w:t>
-      </w:r>
-    </w:p>
-    <w:p>
-      <w:r>
-        <w:t>outfall at Ocean Plan concentration, no minerals sold, no zero-liquid-discharge.</w:t>
+        <w:t xml:space="preserve"> Seawater reverse osmosis on retired coastal power plants, brine back through the permitted outfall at Ocean Plan concentration, no minerals sold, no zero-liquid-discharge.</w:t>
       </w:r>
     </w:p>
     <w:p>
@@ -165,12 +135,7 @@
         <w:t>The joinder.</w:t>
       </w:r>
       <w:r>
-        <w:t xml:space="preserve"> Title I's summer surplus lifts the water to an elevated reservoir; every evening of the year it</w:t>
-      </w:r>
-    </w:p>
-    <w:p>
-      <w:r>
-        <w:t>comes down through pump-turbines to close Title I's peak. Water for the Westside and the coast, and the evening's last shortfall closed by the water on its way down.</w:t>
+        <w:t xml:space="preserve"> Title I's summer surplus lifts the water to an elevated reservoir; every evening of the year it comes down through pump-turbines to close Title I's peak. Water for the Westside and the coast, and the evening's last shortfall closed by the water on its way down.</w:t>
       </w:r>
     </w:p>
     <w:p>
@@ -509,12 +474,7 @@
         <w:pStyle w:val="ListBullet"/>
       </w:pPr>
       <w:r>
-        <w:t>v0.1 said $27.2 B; the built record puts the salt-tower plant it described at $46.1–71.5 B. This proposal builds</w:t>
-      </w:r>
-    </w:p>
-    <w:p>
-      <w:r>
-        <w:t>a different plant and prices it from the record, not the promise.</w:t>
+        <w:t>v0.1 said $27.2 B; the built record puts the salt-tower plant it described at $46.1–71.5 B. This proposal builds a different plant and prices it from the record, not the promise.</w:t>
       </w:r>
     </w:p>
     <w:p>
@@ -565,12 +525,7 @@
         <w:t>$1,682</w:t>
       </w:r>
       <w:r>
-        <w:t xml:space="preserve"> at critical</w:t>
-      </w:r>
-    </w:p>
-    <w:p>
-      <w:r>
-        <w:t>($172 / 279 per MWh).</w:t>
+        <w:t xml:space="preserve"> at critical ($172 / 279 per MWh).</w:t>
       </w:r>
     </w:p>
     <w:p>
@@ -985,12 +940,7 @@
         <w:pStyle w:val="ListBullet"/>
       </w:pPr>
       <w:r>
-        <w:t>The realistic column is critical. The two-year slide is one item, the four-year NEPA statement on the Mojave node,</w:t>
-      </w:r>
-    </w:p>
-    <w:p>
-      <w:r>
-        <w:t>which is why the studies go first.</w:t>
+        <w:t>The realistic column is critical. The two-year slide is one item, the four-year NEPA statement on the Mojave node, which is why the studies go first.</w:t>
       </w:r>
     </w:p>
     <w:p>
@@ -998,12 +948,7 @@
         <w:pStyle w:val="ListBullet"/>
       </w:pPr>
       <w:r>
-        <w:t>Only a pass at the pilot orders the first module. A fail records the nitrate-salt plant on the same field as the</w:t>
-      </w:r>
-    </w:p>
-    <w:p>
-      <w:r>
-        <w:t>route, already priced.</w:t>
+        <w:t>Only a pass at the pilot orders the first module. A fail records the nitrate-salt plant on the same field as the route, already priced.</w:t>
       </w:r>
     </w:p>
     <w:p>
@@ -1019,12 +964,7 @@
         <w:pStyle w:val="ListBullet"/>
       </w:pPr>
       <w:r>
-        <w:t>Every number comes from a program that recomputes it, printed at a middle case and at a critical case where every</w:t>
-      </w:r>
-    </w:p>
-    <w:p>
-      <w:r>
-        <w:t>uncertain constant sits at its adverse end. The design is held to critical; mid is margin.</w:t>
+        <w:t>Every number comes from a program that recomputes it, printed at a middle case and at a critical case where every uncertain constant sits at its adverse end. The design is held to critical; mid is margin.</w:t>
       </w:r>
     </w:p>
     <w:p>
@@ -1040,12 +980,7 @@
         <w:pStyle w:val="ListBullet"/>
       </w:pPr>
       <w:r>
-        <w:t>The plant is sized to a requirement, three million households growing 1.35–1.81× over the term, not to an export that</w:t>
-      </w:r>
-    </w:p>
-    <w:p>
-      <w:r>
-        <w:t>turned out to be negative.</w:t>
+        <w:t>The plant is sized to a requirement, three million households growing 1.35–1.81× over the term, not to an export that turned out to be negative.</w:t>
       </w:r>
     </w:p>
     <w:p>
@@ -1053,12 +988,7 @@
         <w:pStyle w:val="ListBullet"/>
       </w:pPr>
       <w:r>
-        <w:t>It takes no developer's margin and no state subsidy after the build, and keeps the federal storage credit where</w:t>
-      </w:r>
-    </w:p>
-    <w:p>
-      <w:r>
-        <w:t>statute allows.</w:t>
+        <w:t>It takes no developer's margin and no state subsidy after the build, and keeps the federal storage credit where statute allows.</w:t>
       </w:r>
     </w:p>
     <w:p>
@@ -1066,12 +996,7 @@
         <w:pStyle w:val="ListBullet"/>
       </w:pPr>
       <w:r>
-        <w:t>Every technology in it is on a register of 49 published studies and plants, each with a status and a source, and</w:t>
-      </w:r>
-    </w:p>
-    <w:p>
-      <w:r>
-        <w:t>a recommended further study on a dated ladder.</w:t>
+        <w:t>Every technology in it is on a register of 49 published studies and plants, each with a status and a source, and a recommended further study on a dated ladder.</w:t>
       </w:r>
     </w:p>
     <w:p>
@@ -1103,12 +1028,7 @@
         <w:pStyle w:val="ListBullet"/>
       </w:pPr>
       <w:r>
-        <w:t>Title I: the Mojave (Kramer Junction), Imperial (Desert Center) and the Westside — at mid the Westside ties the</w:t>
-      </w:r>
-    </w:p>
-    <w:p>
-      <w:r>
-        <w:t>Mojave for first on land, nexus and grid; at critical the Mojave leads on seismic margin. Land 45,361 / 66,339 acres, with fallowed Westside farmland covering a whole node.</w:t>
+        <w:t>Title I: the Mojave (Kramer Junction), Imperial (Desert Center) and the Westside — at mid the Westside ties the Mojave for first on land, nexus and grid; at critical the Mojave leads on seismic margin. Land 45,361 / 66,339 acres, with fallowed Westside farmland covering a whole node.</w:t>
       </w:r>
     </w:p>
     <w:p>
@@ -1116,12 +1036,7 @@
         <w:pStyle w:val="ListBullet"/>
       </w:pPr>
       <w:r>
-        <w:t>Title II: eight retired or retiring coastal plants screened on seven terms; the Oxnard plain (Ormond Beach, Mandalay)</w:t>
-      </w:r>
-    </w:p>
-    <w:p>
-      <w:r>
-        <w:t>and Moss Landing lead; Huntington Beach carries its 2022 denial as a FAIL; no site is met on every term, so a site study is always owed.</w:t>
+        <w:t>Title II: eight retired or retiring coastal plants screened on seven terms; the Oxnard plain (Ormond Beach, Mandalay) and Moss Landing lead; Huntington Beach carries its 2022 denial as a FAIL; no site is met on every term, so a site study is always owed.</w:t>
       </w:r>
     </w:p>
     <w:p>
@@ -1161,12 +1076,7 @@
         <w:pStyle w:val="ListBullet"/>
       </w:pPr>
       <w:r>
-        <w:t>At the critical case a household pays more than today for one bond term. The proposal says so on every page,</w:t>
-      </w:r>
-    </w:p>
-    <w:p>
-      <w:r>
-        <w:t>because a plan that hides its worst case is not one you can build.</w:t>
+        <w:t>At the critical case a household pays more than today for one bond term. The proposal says so on every page, because a plan that hides its worst case is not one you can build.</w:t>
       </w:r>
     </w:p>
     <w:p>
@@ -1182,12 +1092,7 @@
         <w:pStyle w:val="ListBullet"/>
       </w:pPr>
       <w:r>
-        <w:t>Build the studies now, for $213–463 million, and know within 2–4 years whether the rest is worth</w:t>
-      </w:r>
-    </w:p>
-    <w:p>
-      <w:r>
-        <w:t>$67–114 billion.</w:t>
+        <w:t>Build the studies now, for $213–463 million, and know within 2–4 years whether the rest is worth $67–114 billion.</w:t>
       </w:r>
     </w:p>
     <w:p>

</xml_diff>